<commit_message>
docs(AOFP-199): drop screens flow figures from report 3 and renumber ERD
</commit_message>
<xml_diff>
--- a/docs/review-2/source/Report3_Software_Requirement_Specification_Final.docx
+++ b/docs/review-2/source/Report3_Software_Requirement_Specification_Final.docx
@@ -691,7 +691,7 @@
             <w:fldChar w:fldCharType="separate"/>
           </w:r>
           <w:r>
-            <w:t>18</w:t>
+            <w:t>16</w:t>
           </w:r>
           <w:r>
             <w:fldChar w:fldCharType="end"/>
@@ -741,7 +741,7 @@
             <w:fldChar w:fldCharType="separate"/>
           </w:r>
           <w:r>
-            <w:t>21</w:t>
+            <w:t>19</w:t>
           </w:r>
           <w:r>
             <w:fldChar w:fldCharType="end"/>
@@ -791,7 +791,7 @@
             <w:fldChar w:fldCharType="separate"/>
           </w:r>
           <w:r>
-            <w:t>24</w:t>
+            <w:t>22</w:t>
           </w:r>
           <w:r>
             <w:fldChar w:fldCharType="end"/>
@@ -841,7 +841,7 @@
             <w:fldChar w:fldCharType="separate"/>
           </w:r>
           <w:r>
-            <w:t>26</w:t>
+            <w:t>24</w:t>
           </w:r>
           <w:r>
             <w:fldChar w:fldCharType="end"/>
@@ -891,7 +891,7 @@
             <w:fldChar w:fldCharType="separate"/>
           </w:r>
           <w:r>
-            <w:t>28</w:t>
+            <w:t>26</w:t>
           </w:r>
           <w:r>
             <w:fldChar w:fldCharType="end"/>
@@ -941,7 +941,7 @@
             <w:fldChar w:fldCharType="separate"/>
           </w:r>
           <w:r>
-            <w:t>30</w:t>
+            <w:t>28</w:t>
           </w:r>
           <w:r>
             <w:fldChar w:fldCharType="end"/>
@@ -991,7 +991,7 @@
             <w:fldChar w:fldCharType="separate"/>
           </w:r>
           <w:r>
-            <w:t>32</w:t>
+            <w:t>30</w:t>
           </w:r>
           <w:r>
             <w:fldChar w:fldCharType="end"/>
@@ -1041,7 +1041,7 @@
             <w:fldChar w:fldCharType="separate"/>
           </w:r>
           <w:r>
-            <w:t>33</w:t>
+            <w:t>31</w:t>
           </w:r>
           <w:r>
             <w:fldChar w:fldCharType="end"/>
@@ -1091,7 +1091,7 @@
             <w:fldChar w:fldCharType="separate"/>
           </w:r>
           <w:r>
-            <w:t>34</w:t>
+            <w:t>32</w:t>
           </w:r>
           <w:r>
             <w:fldChar w:fldCharType="end"/>
@@ -1141,7 +1141,7 @@
             <w:fldChar w:fldCharType="separate"/>
           </w:r>
           <w:r>
-            <w:t>34</w:t>
+            <w:t>32</w:t>
           </w:r>
           <w:r>
             <w:fldChar w:fldCharType="end"/>
@@ -1191,7 +1191,7 @@
             <w:fldChar w:fldCharType="separate"/>
           </w:r>
           <w:r>
-            <w:t>38</w:t>
+            <w:t>36</w:t>
           </w:r>
           <w:r>
             <w:fldChar w:fldCharType="end"/>
@@ -1241,7 +1241,7 @@
             <w:fldChar w:fldCharType="separate"/>
           </w:r>
           <w:r>
-            <w:t>38</w:t>
+            <w:t>36</w:t>
           </w:r>
           <w:r>
             <w:fldChar w:fldCharType="end"/>
@@ -1291,7 +1291,7 @@
             <w:fldChar w:fldCharType="separate"/>
           </w:r>
           <w:r>
-            <w:t>38</w:t>
+            <w:t>36</w:t>
           </w:r>
           <w:r>
             <w:fldChar w:fldCharType="end"/>
@@ -1341,7 +1341,7 @@
             <w:fldChar w:fldCharType="separate"/>
           </w:r>
           <w:r>
-            <w:t>39</w:t>
+            <w:t>37</w:t>
           </w:r>
           <w:r>
             <w:fldChar w:fldCharType="end"/>
@@ -1391,7 +1391,7 @@
             <w:fldChar w:fldCharType="separate"/>
           </w:r>
           <w:r>
-            <w:t>39</w:t>
+            <w:t>37</w:t>
           </w:r>
           <w:r>
             <w:fldChar w:fldCharType="end"/>
@@ -1441,7 +1441,7 @@
             <w:fldChar w:fldCharType="separate"/>
           </w:r>
           <w:r>
-            <w:t>39</w:t>
+            <w:t>37</w:t>
           </w:r>
           <w:r>
             <w:fldChar w:fldCharType="end"/>
@@ -1491,7 +1491,7 @@
             <w:fldChar w:fldCharType="separate"/>
           </w:r>
           <w:r>
-            <w:t>40</w:t>
+            <w:t>38</w:t>
           </w:r>
           <w:r>
             <w:fldChar w:fldCharType="end"/>
@@ -1541,7 +1541,7 @@
             <w:fldChar w:fldCharType="separate"/>
           </w:r>
           <w:r>
-            <w:t>40</w:t>
+            <w:t>38</w:t>
           </w:r>
           <w:r>
             <w:fldChar w:fldCharType="end"/>
@@ -1591,7 +1591,7 @@
             <w:fldChar w:fldCharType="separate"/>
           </w:r>
           <w:r>
-            <w:t>41</w:t>
+            <w:t>39</w:t>
           </w:r>
           <w:r>
             <w:fldChar w:fldCharType="end"/>
@@ -9083,7 +9083,7 @@
         <w:spacing w:after="120"/>
       </w:pPr>
       <w:r>
-        <w:t>Notation (as in the template sample): yellow box = public screen (before login); white box = screen after login; rounded box = pop-up dialog; thick border = screen with several tabs (tab names in italics); arrow = navigation. Diagram sources are kept in the repository at docs/diagrams/screens-flow (Mermaid).</w:t>
+        <w:t xml:space="preserve">The screens of the OptiPack staff portal and the AURELLE website, with the roles that use them, are listed in section 3.1.2 Screen Descriptions and section 3.1.3 Screen Authorization.</w:t>
       </w:r>
     </w:p>
     <w:p>
@@ -14817,7 +14817,7 @@
         <w:jc w:val="center"/>
       </w:pPr>
       <w:r>
-        <w:t>Figure 10. Logical entity relationship diagram</w:t>
+        <w:t>Figure 8. Logical entity relationship diagram</w:t>
       </w:r>
     </w:p>
     <w:p>

</xml_diff>